<commit_message>
sua landing web he thong CRM va tach app hiep hoi vione
</commit_message>
<xml_diff>
--- a/document/vione-uiux-spec-fe-be-binding.docx
+++ b/document/vione-uiux-spec-fe-be-binding.docx
@@ -728,7 +728,7 @@
         <w:spacing w:after="100" w:before="200"/>
       </w:pPr>
       <w:r>
-        <w:t xml:space="preserve">1.1 Ngôn ngữ Nhận diện 1: Royal Blue &amp; Pure White (CRM &amp; App Hiệp hội `/association`)</w:t>
+        <w:t xml:space="preserve">1.1 Ngôn ngữ Nhận diện 1: Soft Sky Blue, Pure White &amp; Obsidian (CRM &amp; App Hiệp hội `/association`)</w:t>
       </w:r>
     </w:p>
     <w:p>
@@ -745,20 +745,60 @@
           <w:b/>
           <w:bCs/>
         </w:rPr>
-        <w:t xml:space="preserve">Primary Color</w:t>
-      </w:r>
-      <w:r>
-        <w:t xml:space="preserve">: </w:t>
-      </w:r>
-      <w:r>
-        <w:rPr>
-          <w:rFonts w:ascii="Consolas" w:cs="Consolas" w:eastAsia="Consolas" w:hAnsi="Consolas"/>
-          <w:color w:val="B45309"/>
-        </w:rPr>
-        <w:t xml:space="preserve">#004B91</w:t>
-      </w:r>
-      <w:r>
-        <w:t xml:space="preserve"> (Deep Corporate Blue) - Dùng cho Header, Nút hành động chính (Primary Button), Icon hoạt động.</w:t>
+        <w:t xml:space="preserve">Tôn chỉ Màu sắc App Hiệp hội CEO 1983</w:t>
+      </w:r>
+      <w:r>
+        <w:t xml:space="preserve">: Bảng màu tối giản, sang trọng gồm Xanh da trời dịu nhẹ (Soft Luminous Sky/Ice Blue), Trắng và Đen than Obsidian (</w:t>
+      </w:r>
+      <w:r>
+        <w:rPr>
+          <w:rFonts w:ascii="Consolas" w:cs="Consolas" w:eastAsia="Consolas" w:hAnsi="Consolas"/>
+          <w:color w:val="B45309"/>
+        </w:rPr>
+        <w:t xml:space="preserve">#0B0F19</w:t>
+      </w:r>
+      <w:r>
+        <w:t xml:space="preserve">), tuyệt đối không dùng màu vàng/cam (amber/gold), ngoại trừ:</w:t>
+      </w:r>
+    </w:p>
+    <w:p>
+      <w:pPr>
+        <w:pStyle w:val="ListParagraph"/>
+        <w:numPr>
+          <w:ilvl w:val="0"/>
+          <w:numId w:val="1"/>
+        </w:numPr>
+        <w:spacing w:after="30" w:before="30"/>
+      </w:pPr>
+      <w:r>
+        <w:rPr>
+          <w:i/>
+          <w:iCs/>
+        </w:rPr>
+        <w:t xml:space="preserve">Màu xanh lá (`#10B981` / Emerald)</w:t>
+      </w:r>
+      <w:r>
+        <w:t xml:space="preserve">: Hoạt động, điểm danh thành công, đã tiếp nhận.</w:t>
+      </w:r>
+    </w:p>
+    <w:p>
+      <w:pPr>
+        <w:pStyle w:val="ListParagraph"/>
+        <w:numPr>
+          <w:ilvl w:val="0"/>
+          <w:numId w:val="1"/>
+        </w:numPr>
+        <w:spacing w:after="30" w:before="30"/>
+      </w:pPr>
+      <w:r>
+        <w:rPr>
+          <w:i/>
+          <w:iCs/>
+        </w:rPr>
+        <w:t xml:space="preserve">Màu đỏ (`#EF4444` / Crimson)</w:t>
+      </w:r>
+      <w:r>
+        <w:t xml:space="preserve">: Cảnh báo, quá hạn, chưa đọc, nguy hiểm.</w:t>
       </w:r>
     </w:p>
     <w:p>
@@ -775,20 +815,230 @@
           <w:b/>
           <w:bCs/>
         </w:rPr>
+        <w:t xml:space="preserve">Dark Mode (`.vba-app`)</w:t>
+      </w:r>
+      <w:r>
+        <w:t xml:space="preserve">:</w:t>
+      </w:r>
+    </w:p>
+    <w:p>
+      <w:pPr>
+        <w:pStyle w:val="ListParagraph"/>
+        <w:numPr>
+          <w:ilvl w:val="0"/>
+          <w:numId w:val="1"/>
+        </w:numPr>
+        <w:spacing w:after="30" w:before="30"/>
+      </w:pPr>
+      <w:r>
+        <w:rPr>
+          <w:i/>
+          <w:iCs/>
+        </w:rPr>
+        <w:t xml:space="preserve">Nền chính</w:t>
+      </w:r>
+      <w:r>
+        <w:t xml:space="preserve">: Obsidian Charcoal </w:t>
+      </w:r>
+      <w:r>
+        <w:rPr>
+          <w:rFonts w:ascii="Consolas" w:cs="Consolas" w:eastAsia="Consolas" w:hAnsi="Consolas"/>
+          <w:color w:val="B45309"/>
+        </w:rPr>
+        <w:t xml:space="preserve">#0B0F19</w:t>
+      </w:r>
+      <w:r>
+        <w:t xml:space="preserve">, Nền phụ </w:t>
+      </w:r>
+      <w:r>
+        <w:rPr>
+          <w:rFonts w:ascii="Consolas" w:cs="Consolas" w:eastAsia="Consolas" w:hAnsi="Consolas"/>
+          <w:color w:val="B45309"/>
+        </w:rPr>
+        <w:t xml:space="preserve">#080C14</w:t>
+      </w:r>
+      <w:r>
+        <w:t xml:space="preserve">.</w:t>
+      </w:r>
+    </w:p>
+    <w:p>
+      <w:pPr>
+        <w:pStyle w:val="ListParagraph"/>
+        <w:numPr>
+          <w:ilvl w:val="0"/>
+          <w:numId w:val="1"/>
+        </w:numPr>
+        <w:spacing w:after="30" w:before="30"/>
+      </w:pPr>
+      <w:r>
+        <w:rPr>
+          <w:i/>
+          <w:iCs/>
+        </w:rPr>
+        <w:t xml:space="preserve">Thẻ Card / Surface</w:t>
+      </w:r>
+      <w:r>
+        <w:t xml:space="preserve">: Kính mờ cao cấp </w:t>
+      </w:r>
+      <w:r>
+        <w:rPr>
+          <w:rFonts w:ascii="Consolas" w:cs="Consolas" w:eastAsia="Consolas" w:hAnsi="Consolas"/>
+          <w:color w:val="B45309"/>
+        </w:rPr>
+        <w:t xml:space="preserve">#111622</w:t>
+      </w:r>
+      <w:r>
+        <w:t xml:space="preserve"> / </w:t>
+      </w:r>
+      <w:r>
+        <w:rPr>
+          <w:rFonts w:ascii="Consolas" w:cs="Consolas" w:eastAsia="Consolas" w:hAnsi="Consolas"/>
+          <w:color w:val="B45309"/>
+        </w:rPr>
+        <w:t xml:space="preserve">#151C2C</w:t>
+      </w:r>
+      <w:r>
+        <w:t xml:space="preserve">, viền kính băng </w:t>
+      </w:r>
+      <w:r>
+        <w:rPr>
+          <w:rFonts w:ascii="Consolas" w:cs="Consolas" w:eastAsia="Consolas" w:hAnsi="Consolas"/>
+          <w:color w:val="B45309"/>
+        </w:rPr>
+        <w:t xml:space="preserve">rgba(186, 230, 253, 0.15)</w:t>
+      </w:r>
+      <w:r>
+        <w:t xml:space="preserve">.</w:t>
+      </w:r>
+    </w:p>
+    <w:p>
+      <w:pPr>
+        <w:pStyle w:val="ListParagraph"/>
+        <w:numPr>
+          <w:ilvl w:val="0"/>
+          <w:numId w:val="1"/>
+        </w:numPr>
+        <w:spacing w:after="30" w:before="30"/>
+      </w:pPr>
+      <w:r>
+        <w:rPr>
+          <w:i/>
+          <w:iCs/>
+        </w:rPr>
+        <w:t xml:space="preserve">Primary Accent</w:t>
+      </w:r>
+      <w:r>
+        <w:t xml:space="preserve">: Soft Ice Sky </w:t>
+      </w:r>
+      <w:r>
+        <w:rPr>
+          <w:rFonts w:ascii="Consolas" w:cs="Consolas" w:eastAsia="Consolas" w:hAnsi="Consolas"/>
+          <w:color w:val="B45309"/>
+        </w:rPr>
+        <w:t xml:space="preserve">#7DD3FC</w:t>
+      </w:r>
+      <w:r>
+        <w:t xml:space="preserve"> (Sky-300) dịu mắt, thanh thoát, không bị đậm gắt.</w:t>
+      </w:r>
+    </w:p>
+    <w:p>
+      <w:pPr>
+        <w:pStyle w:val="ListParagraph"/>
+        <w:numPr>
+          <w:ilvl w:val="0"/>
+          <w:numId w:val="1"/>
+        </w:numPr>
+        <w:spacing w:after="30" w:before="30"/>
+      </w:pPr>
+      <w:r>
+        <w:rPr>
+          <w:i/>
+          <w:iCs/>
+        </w:rPr>
         <w:t xml:space="preserve">Secondary Accent</w:t>
       </w:r>
       <w:r>
-        <w:t xml:space="preserve">: </w:t>
-      </w:r>
-      <w:r>
-        <w:rPr>
-          <w:rFonts w:ascii="Consolas" w:cs="Consolas" w:eastAsia="Consolas" w:hAnsi="Consolas"/>
-          <w:color w:val="B45309"/>
-        </w:rPr>
-        <w:t xml:space="preserve">#0284C7</w:t>
-      </w:r>
-      <w:r>
-        <w:t xml:space="preserve"> (Sky Cyan) - Dùng cho Badge trạng thái, Đồ thị tăng trưởng, Hiệu ứng hover.</w:t>
+        <w:t xml:space="preserve">: Frost Blue </w:t>
+      </w:r>
+      <w:r>
+        <w:rPr>
+          <w:rFonts w:ascii="Consolas" w:cs="Consolas" w:eastAsia="Consolas" w:hAnsi="Consolas"/>
+          <w:color w:val="B45309"/>
+        </w:rPr>
+        <w:t xml:space="preserve">#BAE6FD</w:t>
+      </w:r>
+      <w:r>
+        <w:t xml:space="preserve"> (Sky-200).</w:t>
+      </w:r>
+    </w:p>
+    <w:p>
+      <w:pPr>
+        <w:pStyle w:val="ListParagraph"/>
+        <w:numPr>
+          <w:ilvl w:val="0"/>
+          <w:numId w:val="1"/>
+        </w:numPr>
+        <w:spacing w:after="30" w:before="30"/>
+      </w:pPr>
+      <w:r>
+        <w:rPr>
+          <w:i/>
+          <w:iCs/>
+        </w:rPr>
+        <w:t xml:space="preserve">Nút bấm &amp; Badge chính (`.vba-gold-grad`)</w:t>
+      </w:r>
+      <w:r>
+        <w:t xml:space="preserve">: Gradient </w:t>
+      </w:r>
+      <w:r>
+        <w:rPr>
+          <w:rFonts w:ascii="Consolas" w:cs="Consolas" w:eastAsia="Consolas" w:hAnsi="Consolas"/>
+          <w:color w:val="B45309"/>
+        </w:rPr>
+        <w:t xml:space="preserve">linear-gradient(135deg, #38BDF8 0%, #7DD3FC 100%)</w:t>
+      </w:r>
+      <w:r>
+        <w:t xml:space="preserve"> với chữ đậm tối </w:t>
+      </w:r>
+      <w:r>
+        <w:rPr>
+          <w:rFonts w:ascii="Consolas" w:cs="Consolas" w:eastAsia="Consolas" w:hAnsi="Consolas"/>
+          <w:color w:val="B45309"/>
+        </w:rPr>
+        <w:t xml:space="preserve">#071322</w:t>
+      </w:r>
+      <w:r>
+        <w:t xml:space="preserve"> tạo độ tương phản cao, hiện đại.</w:t>
+      </w:r>
+    </w:p>
+    <w:p>
+      <w:pPr>
+        <w:pStyle w:val="ListParagraph"/>
+        <w:numPr>
+          <w:ilvl w:val="0"/>
+          <w:numId w:val="1"/>
+        </w:numPr>
+        <w:spacing w:after="30" w:before="30"/>
+      </w:pPr>
+      <w:r>
+        <w:rPr>
+          <w:i/>
+          <w:iCs/>
+        </w:rPr>
+        <w:t xml:space="preserve">Hiệu ứng chữ phát sáng (`.vba-gold-text`)</w:t>
+      </w:r>
+      <w:r>
+        <w:t xml:space="preserve">: Gradient </w:t>
+      </w:r>
+      <w:r>
+        <w:rPr>
+          <w:rFonts w:ascii="Consolas" w:cs="Consolas" w:eastAsia="Consolas" w:hAnsi="Consolas"/>
+          <w:color w:val="B45309"/>
+        </w:rPr>
+        <w:t xml:space="preserve">linear-gradient(135deg, #FFFFFF 0%, #BAE6FD 45%, #7DD3FC 100%)</w:t>
+      </w:r>
+      <w:r>
+        <w:t xml:space="preserve">.</w:t>
       </w:r>
     </w:p>
     <w:p>
@@ -805,47 +1055,7 @@
           <w:b/>
           <w:bCs/>
         </w:rPr>
-        <w:t xml:space="preserve">Background Surface</w:t>
-      </w:r>
-      <w:r>
-        <w:t xml:space="preserve">: </w:t>
-      </w:r>
-      <w:r>
-        <w:rPr>
-          <w:rFonts w:ascii="Consolas" w:cs="Consolas" w:eastAsia="Consolas" w:hAnsi="Consolas"/>
-          <w:color w:val="B45309"/>
-        </w:rPr>
-        <w:t xml:space="preserve">#F8FAFC</w:t>
-      </w:r>
-      <w:r>
-        <w:t xml:space="preserve"> và </w:t>
-      </w:r>
-      <w:r>
-        <w:rPr>
-          <w:rFonts w:ascii="Consolas" w:cs="Consolas" w:eastAsia="Consolas" w:hAnsi="Consolas"/>
-          <w:color w:val="B45309"/>
-        </w:rPr>
-        <w:t xml:space="preserve">#FFFFFF</w:t>
-      </w:r>
-      <w:r>
-        <w:t xml:space="preserve"> - Nền thẻ Card sạch sẽ, độ tương phản cao, tối ưu đọc văn bản.</w:t>
-      </w:r>
-    </w:p>
-    <w:p>
-      <w:pPr>
-        <w:pStyle w:val="ListParagraph"/>
-        <w:numPr>
-          <w:ilvl w:val="0"/>
-          <w:numId w:val="1"/>
-        </w:numPr>
-        <w:spacing w:after="30" w:before="30"/>
-      </w:pPr>
-      <w:r>
-        <w:rPr>
-          <w:b/>
-          <w:bCs/>
-        </w:rPr>
-        <w:t xml:space="preserve">Status Colors</w:t>
+        <w:t xml:space="preserve">Light Mode (`html:not(.dark) .vba-app`)</w:t>
       </w:r>
       <w:r>
         <w:t xml:space="preserve">:</w:t>
@@ -865,30 +1075,30 @@
           <w:i/>
           <w:iCs/>
         </w:rPr>
-        <w:t xml:space="preserve">Đã gia hạn (Renewed)</w:t>
-      </w:r>
-      <w:r>
-        <w:t xml:space="preserve">: Xanh lá Emerald </w:t>
-      </w:r>
-      <w:r>
-        <w:rPr>
-          <w:rFonts w:ascii="Consolas" w:cs="Consolas" w:eastAsia="Consolas" w:hAnsi="Consolas"/>
-          <w:color w:val="B45309"/>
-        </w:rPr>
-        <w:t xml:space="preserve">#10B981</w:t>
-      </w:r>
-      <w:r>
-        <w:t xml:space="preserve"> (Nền </w:t>
-      </w:r>
-      <w:r>
-        <w:rPr>
-          <w:rFonts w:ascii="Consolas" w:cs="Consolas" w:eastAsia="Consolas" w:hAnsi="Consolas"/>
-          <w:color w:val="B45309"/>
-        </w:rPr>
-        <w:t xml:space="preserve">#ECFDF5</w:t>
-      </w:r>
-      <w:r>
-        <w:t xml:space="preserve">).</w:t>
+        <w:t xml:space="preserve">Nền chính</w:t>
+      </w:r>
+      <w:r>
+        <w:t xml:space="preserve">: Executive Pure White </w:t>
+      </w:r>
+      <w:r>
+        <w:rPr>
+          <w:rFonts w:ascii="Consolas" w:cs="Consolas" w:eastAsia="Consolas" w:hAnsi="Consolas"/>
+          <w:color w:val="B45309"/>
+        </w:rPr>
+        <w:t xml:space="preserve">#FFFFFF</w:t>
+      </w:r>
+      <w:r>
+        <w:t xml:space="preserve">, Nền phụ </w:t>
+      </w:r>
+      <w:r>
+        <w:rPr>
+          <w:rFonts w:ascii="Consolas" w:cs="Consolas" w:eastAsia="Consolas" w:hAnsi="Consolas"/>
+          <w:color w:val="B45309"/>
+        </w:rPr>
+        <w:t xml:space="preserve">#F8FAFC</w:t>
+      </w:r>
+      <w:r>
+        <w:t xml:space="preserve">.</w:t>
       </w:r>
     </w:p>
     <w:p>
@@ -905,30 +1115,30 @@
           <w:i/>
           <w:iCs/>
         </w:rPr>
-        <w:t xml:space="preserve">Sắp đến hạn (Due)</w:t>
-      </w:r>
-      <w:r>
-        <w:t xml:space="preserve">: Vàng cam Amber </w:t>
-      </w:r>
-      <w:r>
-        <w:rPr>
-          <w:rFonts w:ascii="Consolas" w:cs="Consolas" w:eastAsia="Consolas" w:hAnsi="Consolas"/>
-          <w:color w:val="B45309"/>
-        </w:rPr>
-        <w:t xml:space="preserve">#F59E0B</w:t>
-      </w:r>
-      <w:r>
-        <w:t xml:space="preserve"> (Nền </w:t>
-      </w:r>
-      <w:r>
-        <w:rPr>
-          <w:rFonts w:ascii="Consolas" w:cs="Consolas" w:eastAsia="Consolas" w:hAnsi="Consolas"/>
-          <w:color w:val="B45309"/>
-        </w:rPr>
-        <w:t xml:space="preserve">#FFFBEB</w:t>
-      </w:r>
-      <w:r>
-        <w:t xml:space="preserve">).</w:t>
+        <w:t xml:space="preserve">Thẻ Card</w:t>
+      </w:r>
+      <w:r>
+        <w:t xml:space="preserve">: Trắng </w:t>
+      </w:r>
+      <w:r>
+        <w:rPr>
+          <w:rFonts w:ascii="Consolas" w:cs="Consolas" w:eastAsia="Consolas" w:hAnsi="Consolas"/>
+          <w:color w:val="B45309"/>
+        </w:rPr>
+        <w:t xml:space="preserve">#FFFFFF</w:t>
+      </w:r>
+      <w:r>
+        <w:t xml:space="preserve">, viền xanh nhẹ </w:t>
+      </w:r>
+      <w:r>
+        <w:rPr>
+          <w:rFonts w:ascii="Consolas" w:cs="Consolas" w:eastAsia="Consolas" w:hAnsi="Consolas"/>
+          <w:color w:val="B45309"/>
+        </w:rPr>
+        <w:t xml:space="preserve">rgba(14, 165, 233, 0.14)</w:t>
+      </w:r>
+      <w:r>
+        <w:t xml:space="preserve">.</w:t>
       </w:r>
     </w:p>
     <w:p>
@@ -945,30 +1155,40 @@
           <w:i/>
           <w:iCs/>
         </w:rPr>
-        <w:t xml:space="preserve">Đã quá hạn (Overdue)</w:t>
-      </w:r>
-      <w:r>
-        <w:t xml:space="preserve">: Đỏ Rose </w:t>
-      </w:r>
-      <w:r>
-        <w:rPr>
-          <w:rFonts w:ascii="Consolas" w:cs="Consolas" w:eastAsia="Consolas" w:hAnsi="Consolas"/>
-          <w:color w:val="B45309"/>
-        </w:rPr>
-        <w:t xml:space="preserve">#EF4444</w:t>
-      </w:r>
-      <w:r>
-        <w:t xml:space="preserve"> (Nền </w:t>
-      </w:r>
-      <w:r>
-        <w:rPr>
-          <w:rFonts w:ascii="Consolas" w:cs="Consolas" w:eastAsia="Consolas" w:hAnsi="Consolas"/>
-          <w:color w:val="B45309"/>
-        </w:rPr>
-        <w:t xml:space="preserve">#FEF2F2</w:t>
-      </w:r>
-      <w:r>
-        <w:t xml:space="preserve">).</w:t>
+        <w:t xml:space="preserve">Primary Accent</w:t>
+      </w:r>
+      <w:r>
+        <w:t xml:space="preserve">: </w:t>
+      </w:r>
+      <w:r>
+        <w:rPr>
+          <w:rFonts w:ascii="Consolas" w:cs="Consolas" w:eastAsia="Consolas" w:hAnsi="Consolas"/>
+          <w:color w:val="B45309"/>
+        </w:rPr>
+        <w:t xml:space="preserve">#0EA5E9</w:t>
+      </w:r>
+      <w:r>
+        <w:t xml:space="preserve"> (Sky-500) kết hợp </w:t>
+      </w:r>
+      <w:r>
+        <w:rPr>
+          <w:rFonts w:ascii="Consolas" w:cs="Consolas" w:eastAsia="Consolas" w:hAnsi="Consolas"/>
+          <w:color w:val="B45309"/>
+        </w:rPr>
+        <w:t xml:space="preserve">#38BDF8</w:t>
+      </w:r>
+      <w:r>
+        <w:t xml:space="preserve"> (Sky-400), xóa bỏ hoàn toàn navy đậm </w:t>
+      </w:r>
+      <w:r>
+        <w:rPr>
+          <w:rFonts w:ascii="Consolas" w:cs="Consolas" w:eastAsia="Consolas" w:hAnsi="Consolas"/>
+          <w:color w:val="B45309"/>
+        </w:rPr>
+        <w:t xml:space="preserve">#1D4ED8</w:t>
+      </w:r>
+      <w:r>
+        <w:t xml:space="preserve">.</w:t>
       </w:r>
     </w:p>
     <w:p>
@@ -985,30 +1205,30 @@
           <w:i/>
           <w:iCs/>
         </w:rPr>
-        <w:t xml:space="preserve">Kỳ tiếp theo (Upcoming)</w:t>
-      </w:r>
-      <w:r>
-        <w:t xml:space="preserve">: Xanh dương Indigo </w:t>
-      </w:r>
-      <w:r>
-        <w:rPr>
-          <w:rFonts w:ascii="Consolas" w:cs="Consolas" w:eastAsia="Consolas" w:hAnsi="Consolas"/>
-          <w:color w:val="B45309"/>
-        </w:rPr>
-        <w:t xml:space="preserve">#6366F1</w:t>
-      </w:r>
-      <w:r>
-        <w:t xml:space="preserve"> (Nền </w:t>
-      </w:r>
-      <w:r>
-        <w:rPr>
-          <w:rFonts w:ascii="Consolas" w:cs="Consolas" w:eastAsia="Consolas" w:hAnsi="Consolas"/>
-          <w:color w:val="B45309"/>
-        </w:rPr>
-        <w:t xml:space="preserve">#EEF2FF</w:t>
-      </w:r>
-      <w:r>
-        <w:t xml:space="preserve">).</w:t>
+        <w:t xml:space="preserve">Nút bấm</w:t>
+      </w:r>
+      <w:r>
+        <w:t xml:space="preserve">: </w:t>
+      </w:r>
+      <w:r>
+        <w:rPr>
+          <w:rFonts w:ascii="Consolas" w:cs="Consolas" w:eastAsia="Consolas" w:hAnsi="Consolas"/>
+          <w:color w:val="B45309"/>
+        </w:rPr>
+        <w:t xml:space="preserve">linear-gradient(135deg, #0EA5E9 0%, #38BDF8 100%)</w:t>
+      </w:r>
+      <w:r>
+        <w:t xml:space="preserve">, chữ trắng </w:t>
+      </w:r>
+      <w:r>
+        <w:rPr>
+          <w:rFonts w:ascii="Consolas" w:cs="Consolas" w:eastAsia="Consolas" w:hAnsi="Consolas"/>
+          <w:color w:val="B45309"/>
+        </w:rPr>
+        <w:t xml:space="preserve">#FFFFFF</w:t>
+      </w:r>
+      <w:r>
+        <w:t xml:space="preserve">.</w:t>
       </w:r>
     </w:p>
     <w:p>

</xml_diff>